<commit_message>
deepdive-top100: 3 deep dives (Siddhika Coating, Arrow Greentech, Lumax Industries) - reconciled conflicting fundamentals data for Arrow Greentech, confirmed order-book-backed growth for Lumax, confirmed Coffee-Can consistency for Siddhika; no light-lane backfill this run (deep batch full at 3)
Co-Authored-By: Claude Sonnet 5 <noreply@anthropic.com>
</commit_message>
<xml_diff>
--- a/projects/valuepickr-open-screen/docs/Siddhika Coatings Ltd.docx
+++ b/projects/valuepickr-open-screen/docs/Siddhika Coatings Ltd.docx
@@ -99,61 +99,34 @@
           </w:tcPr>
           <w:p>
             <w:r>
-              <w:t xml:space="preserve">~Rs 133 Cr</w:t>
-            </w:r>
-          </w:p>
-        </w:tc>
-      </w:tr>
-      <w:tr>
-        <w:tc>
-          <w:tcPr>
-            <w:tcW w:type="dxa" w:w="3200"/>
-            <w:shd w:fill="F2F2F2" w:val="clear"/>
-          </w:tcPr>
-          <w:p>
-            <w:r>
-              <w:rPr>
-                <w:b/>
-                <w:bCs/>
-              </w:rPr>
-              <w:t xml:space="preserve">ROE</w:t>
-            </w:r>
-          </w:p>
-        </w:tc>
-        <w:tc>
-          <w:tcPr>
-            <w:tcW w:type="dxa" w:w="5800"/>
-          </w:tcPr>
-          <w:p>
-            <w:r>
-              <w:t xml:space="preserve">~24.47% (3-yr)</w:t>
-            </w:r>
-          </w:p>
-        </w:tc>
-      </w:tr>
-      <w:tr>
-        <w:tc>
-          <w:tcPr>
-            <w:tcW w:type="dxa" w:w="3200"/>
-            <w:shd w:fill="F2F2F2" w:val="clear"/>
-          </w:tcPr>
-          <w:p>
-            <w:r>
-              <w:rPr>
-                <w:b/>
-                <w:bCs/>
-              </w:rPr>
-              <w:t xml:space="preserve">ROIC</w:t>
-            </w:r>
-          </w:p>
-        </w:tc>
-        <w:tc>
-          <w:tcPr>
-            <w:tcW w:type="dxa" w:w="5800"/>
-          </w:tcPr>
-          <w:p>
-            <w:r>
-              <w:t xml:space="preserve">~17.63%</w:t>
+              <w:t xml:space="preserve">~Rs 140 Cr</w:t>
+            </w:r>
+          </w:p>
+        </w:tc>
+      </w:tr>
+      <w:tr>
+        <w:tc>
+          <w:tcPr>
+            <w:tcW w:type="dxa" w:w="3200"/>
+            <w:shd w:fill="F2F2F2" w:val="clear"/>
+          </w:tcPr>
+          <w:p>
+            <w:r>
+              <w:rPr>
+                <w:b/>
+                <w:bCs/>
+              </w:rPr>
+              <w:t xml:space="preserve">ROE / ROCE</w:t>
+            </w:r>
+          </w:p>
+        </w:tc>
+        <w:tc>
+          <w:tcPr>
+            <w:tcW w:type="dxa" w:w="5800"/>
+          </w:tcPr>
+          <w:p>
+            <w:r>
+              <w:t xml:space="preserve">~24% ROE; ROCE ~30-32% (FY25), improving</w:t>
             </w:r>
           </w:p>
         </w:tc>
@@ -180,7 +153,7 @@
           </w:tcPr>
           <w:p>
             <w:r>
-              <w:t xml:space="preserve">~32% latest annual, ~20.6% avg/yr</w:t>
+              <w:t xml:space="preserve">FY22-FY26 CAGR ~28%; FY26 sales Rs 54.9 Cr (+14% YoY, decelerating off a higher base)</w:t>
             </w:r>
           </w:p>
         </w:tc>
@@ -207,61 +180,88 @@
           </w:tcPr>
           <w:p>
             <w:r>
-              <w:t xml:space="preserve">Debt-free</w:t>
-            </w:r>
-          </w:p>
-        </w:tc>
-      </w:tr>
-      <w:tr>
-        <w:tc>
-          <w:tcPr>
-            <w:tcW w:type="dxa" w:w="3200"/>
-            <w:shd w:fill="F2F2F2" w:val="clear"/>
-          </w:tcPr>
-          <w:p>
-            <w:r>
-              <w:rPr>
-                <w:b/>
-                <w:bCs/>
-              </w:rPr>
-              <w:t xml:space="preserve">FY24 EPS / dividend</w:t>
-            </w:r>
-          </w:p>
-        </w:tc>
-        <w:tc>
-          <w:tcPr>
-            <w:tcW w:type="dxa" w:w="5800"/>
-          </w:tcPr>
-          <w:p>
-            <w:r>
-              <w:t xml:space="preserve">Rs 14.84 EPS; 1:1 bonus; ~33% dividend payout</w:t>
-            </w:r>
-          </w:p>
-        </w:tc>
-      </w:tr>
-      <w:tr>
-        <w:tc>
-          <w:tcPr>
-            <w:tcW w:type="dxa" w:w="3200"/>
-            <w:shd w:fill="F2F2F2" w:val="clear"/>
-          </w:tcPr>
-          <w:p>
-            <w:r>
-              <w:rPr>
-                <w:b/>
-                <w:bCs/>
-              </w:rPr>
-              <w:t xml:space="preserve">Latest quarter (Q2FY26)</w:t>
-            </w:r>
-          </w:p>
-        </w:tc>
-        <w:tc>
-          <w:tcPr>
-            <w:tcW w:type="dxa" w:w="5800"/>
-          </w:tcPr>
-          <w:p>
-            <w:r>
-              <w:t xml:space="preserve">OPM ~20%, highest ever, decent growth continuing</w:t>
+              <w:t xml:space="preserve">Debt-free; net cash ~Rs 9.7 Cr</w:t>
+            </w:r>
+          </w:p>
+        </w:tc>
+      </w:tr>
+      <w:tr>
+        <w:tc>
+          <w:tcPr>
+            <w:tcW w:type="dxa" w:w="3200"/>
+            <w:shd w:fill="F2F2F2" w:val="clear"/>
+          </w:tcPr>
+          <w:p>
+            <w:r>
+              <w:rPr>
+                <w:b/>
+                <w:bCs/>
+              </w:rPr>
+              <w:t xml:space="preserve">FY26 EPS / dividend</w:t>
+            </w:r>
+          </w:p>
+        </w:tc>
+        <w:tc>
+          <w:tcPr>
+            <w:tcW w:type="dxa" w:w="5800"/>
+          </w:tcPr>
+          <w:p>
+            <w:r>
+              <w:t xml:space="preserve">Rs 15.96 EPS; Rs 4/share final dividend (Jul-2026 AGM)</w:t>
+            </w:r>
+          </w:p>
+        </w:tc>
+      </w:tr>
+      <w:tr>
+        <w:tc>
+          <w:tcPr>
+            <w:tcW w:type="dxa" w:w="3200"/>
+            <w:shd w:fill="F2F2F2" w:val="clear"/>
+          </w:tcPr>
+          <w:p>
+            <w:r>
+              <w:rPr>
+                <w:b/>
+                <w:bCs/>
+              </w:rPr>
+              <w:t xml:space="preserve">OPM trend</w:t>
+            </w:r>
+          </w:p>
+        </w:tc>
+        <w:tc>
+          <w:tcPr>
+            <w:tcW w:type="dxa" w:w="5800"/>
+          </w:tcPr>
+          <w:p>
+            <w:r>
+              <w:t xml:space="preserve">~9% (FY22) -&gt; ~22% (FY26) -- structural margin expansion on scale, record highs in H1/H2 FY26</w:t>
+            </w:r>
+          </w:p>
+        </w:tc>
+      </w:tr>
+      <w:tr>
+        <w:tc>
+          <w:tcPr>
+            <w:tcW w:type="dxa" w:w="3200"/>
+            <w:shd w:fill="F2F2F2" w:val="clear"/>
+          </w:tcPr>
+          <w:p>
+            <w:r>
+              <w:rPr>
+                <w:b/>
+                <w:bCs/>
+              </w:rPr>
+              <w:t xml:space="preserve">Valuation</w:t>
+            </w:r>
+          </w:p>
+        </w:tc>
+        <w:tc>
+          <w:tcPr>
+            <w:tcW w:type="dxa" w:w="5800"/>
+          </w:tcPr>
+          <w:p>
+            <w:r>
+              <w:t xml:space="preserve">~14.5x trailing P/E -- looks cheap for the ROCE/consistency on offer</w:t>
             </w:r>
           </w:p>
         </w:tc>
@@ -277,7 +277,7 @@
         <w:spacing w:after="120"/>
       </w:pPr>
       <w:r>
-        <w:t xml:space="preserve">A genuinely clean small-cap: debt-free, ~24% ROE, steady 20-25% revenue growth driven by the 'organised sector taking share from unorganised' theme in paint contracting, and a multi-year track record of consistent profitability and rising dividends (FY20 topline ~Rs 30 Cr/PAT ~Rs 3.8 Cr through FY24 topline ~Rs 37 Cr/PAT ~Rs 4.5 Cr, then a further ~50% topline jump and doubled profit reported Nov-2024, and Q2FY26 OPM hit a record ~20%). The recurring, multi-year concern -- raised independently by the OP (rk1771) and a trusted user (sameernics) across 2024-2026 -- is capital allocation: the company generates more cash than the business needs and has been parking the surplus in mutual funds and fixed deposits rather than reinvesting or returning it, which management confirms is 'cash management only' but which will mechanically depress ROE as the MF book grows relative to the operating business.</w:t>
+        <w:t xml:space="preserve">A genuinely clean small-cap: debt-free, ~24% ROE / ~30%+ ROCE, and a track record that clears the Coffee-Can bar in all 3 checkable fiscal years (FY23-FY25: both &gt;=10% revenue growth and &gt;=15% ROCE every year). Revenue compounded ~28%/yr FY22-FY26 while OPM structurally expanded from ~9% to ~22% as fixed operating costs of a project-application business got absorbed by scale -- FY26 half-yearly margins hit fresh record highs. Growth itself is now visibly decelerating (half-yearly YoY: +48% -&gt; +17% -&gt; +15% -&gt; +14% over the last four periods) off a much larger base, and at ~14.5x trailing P/E the market does not look like it is pricing in the quality on offer. The recurring, multi-year concern -- raised independently by the OP (rk1771) and a trusted user (sameernics) across 2024-2026, and confirmed by this pass's primary-document read -- is capital allocation: the company generates more cash than the business needs and has been parking the surplus in mutual funds and fixed deposits (net cash ~Rs 9.7 Cr) rather than reinvesting or returning it, which management confirms is 'cash management only.' Promoter holding has been flat at 63.09% for 2+ years with no pledge -- no ownership-alignment red flag.</w:t>
       </w:r>
     </w:p>
     <w:p>
@@ -286,62 +286,7 @@
         <w:spacing w:after="120" w:before="280"/>
       </w:pPr>
       <w:r>
-        <w:t xml:space="preserve">Technical Read (Weekly / Monthly MACD + Bollinger Bands, or RSI/CCI/Williams %R proxy)</w:t>
-      </w:r>
-    </w:p>
-    <w:p>
-      <w:pPr>
-        <w:spacing w:after="120"/>
-      </w:pPr>
-      <w:r>
-        <w:t xml:space="preserve">Not escalated to charts -- a low-liquidity NSE Emerge micro-cap where technical reads are unreliable (see manipulation caution below).</w:t>
-      </w:r>
-    </w:p>
-    <w:p>
-      <w:pPr>
-        <w:pStyle w:val="Heading1"/>
-        <w:spacing w:after="120" w:before="280"/>
-      </w:pPr>
-      <w:r>
-        <w:t xml:space="preserve">ValuePickr Community Signal</w:t>
-      </w:r>
-    </w:p>
-    <w:p>
-      <w:pPr>
-        <w:spacing w:after="120"/>
-      </w:pPr>
-      <w:r>
-        <w:t xml:space="preserve">33-post thread (2022-11 to 2026-09-10), first-time read, whole thread in one batch. Long-running, substantive OP (rk1771, non-trusted but a consistent, well-informed multi-year tracker) with genuine back-and-forth on business quality, liquidity risk, and capital allocation. Sentiment is constructively positive throughout, with real scrutiny rather than pure promotion.</w:t>
-      </w:r>
-    </w:p>
-    <w:p>
-      <w:pPr>
-        <w:spacing w:after="120"/>
-      </w:pPr>
-      <w:r>
-        <w:rPr>
-          <w:b/>
-          <w:bCs/>
-          <w:sz w:val="20"/>
-          <w:szCs w:val="20"/>
-        </w:rPr>
-        <w:t xml:space="preserve">High-conviction call from a top contributor: </w:t>
-      </w:r>
-      <w:r>
-        <w:rPr>
-          <w:sz w:val="20"/>
-          <w:szCs w:val="20"/>
-        </w:rPr>
-        <w:t xml:space="preserve">sameernics (TRUSTED, elevated) raised two distinct concerns over time: in 2023, that the stock was highly illiquid and trading in upper circuits on almost no volume ('prone to operator manipulation') while calling it 'predominantly a trading company' commanding a rich P/E of ~40 -- a characterisation rk1771 pushed back on (application, not resale, business); by 2024, sameernics's tone had shifted to acknowledging it as 'a niche play in the paint segment' with 'good prospects.' In Sept-2026, an untrusted new poster (purohitjii) flagged a 69% YoY jump in MD remuneration (traced to a 0.6% sales-linked commission across 4 directors) and asked pointed questions about headcount/facilities disclosure -- unresolved but not escalated by anyone else in the thread as of this run.</w:t>
-      </w:r>
-    </w:p>
-    <w:p>
-      <w:pPr>
-        <w:pStyle w:val="Heading1"/>
-        <w:spacing w:after="120" w:before="280"/>
-      </w:pPr>
-      <w:r>
-        <w:t xml:space="preserve">Trusted-User Signals (Ongoing)</w:t>
+        <w:t xml:space="preserve">Deep-Dive: Primary Documents (Annual Reports, Quarterly Results, Exchange Filings)</w:t>
       </w:r>
     </w:p>
     <w:p>
@@ -356,12 +301,12 @@
           <w:sz w:val="18"/>
           <w:szCs w:val="18"/>
         </w:rPr>
-        <w:t xml:space="preserve">Every time a trusted user expresses clear conviction on this stock, most recent first — this section accumulates over time, it isn't a one-time snapshot.</w:t>
-      </w:r>
-    </w:p>
-    <w:p>
-      <w:pPr>
-        <w:spacing w:after="100"/>
+        <w:t xml:space="preserve">Pass 1 — 2026-09-17. Built from the company's own filings (3 years of annual reports, ~4 quarters of results/concalls, and 6 months of BSE/NSE announcements), read via the web — a deeper layer than the forum-sentiment read below.</w:t>
+      </w:r>
+    </w:p>
+    <w:p>
+      <w:pPr>
+        <w:spacing w:after="120"/>
       </w:pPr>
       <w:r>
         <w:rPr>
@@ -370,8 +315,360 @@
           <w:sz w:val="20"/>
           <w:szCs w:val="20"/>
         </w:rPr>
-        <w:t xml:space="preserve">2024-01-01 — undefined</w:t>
-      </w:r>
+        <w:t xml:space="preserve">Sources reviewed this pass:</w:t>
+      </w:r>
+    </w:p>
+    <w:p>
+      <w:pPr>
+        <w:pStyle w:val="ListParagraph"/>
+        <w:numPr>
+          <w:ilvl w:val="0"/>
+          <w:numId w:val="1"/>
+        </w:numPr>
+        <w:spacing w:after="60"/>
+      </w:pPr>
+      <w:r>
+        <w:t xml:space="preserve">FY22-FY26 annual results + H1/H2 half-yearly results via screener.in (SME/Emerge company reports half-yearly, not quarterly)</w:t>
+      </w:r>
+    </w:p>
+    <w:p>
+      <w:pPr>
+        <w:pStyle w:val="ListParagraph"/>
+        <w:numPr>
+          <w:ilvl w:val="0"/>
+          <w:numId w:val="1"/>
+        </w:numPr>
+        <w:spacing w:after="60"/>
+      </w:pPr>
+      <w:r>
+        <w:t xml:space="preserve">Shareholding pattern Mar-2024 through Mar-2026</w:t>
+      </w:r>
+    </w:p>
+    <w:p>
+      <w:pPr>
+        <w:pStyle w:val="ListParagraph"/>
+        <w:numPr>
+          <w:ilvl w:val="0"/>
+          <w:numId w:val="1"/>
+        </w:numPr>
+        <w:spacing w:after="60"/>
+      </w:pPr>
+      <w:r>
+        <w:t xml:space="preserve">BSE 16th AGM outcome (Jul-2026) + forum thread through 2026-09-10</w:t>
+      </w:r>
+    </w:p>
+    <w:p>
+      <w:pPr>
+        <w:spacing w:after="120"/>
+      </w:pPr>
+      <w:r>
+        <w:rPr>
+          <w:b/>
+          <w:bCs/>
+          <w:sz w:val="20"/>
+          <w:szCs w:val="20"/>
+        </w:rPr>
+        <w:t xml:space="preserve">Annual-report findings (3-year view):</w:t>
+      </w:r>
+    </w:p>
+    <w:p>
+      <w:pPr>
+        <w:pStyle w:val="ListParagraph"/>
+        <w:numPr>
+          <w:ilvl w:val="0"/>
+          <w:numId w:val="1"/>
+        </w:numPr>
+        <w:spacing w:after="60"/>
+      </w:pPr>
+      <w:r>
+        <w:t xml:space="preserve">Revenue grew from Rs 20.35 Cr (FY22) to Rs 54.90 Cr (FY26), a ~28% 5-yr CAGR, with PAT compounding faster (~62% 5-yr CAGR) on margin expansion.</w:t>
+      </w:r>
+    </w:p>
+    <w:p>
+      <w:pPr>
+        <w:pStyle w:val="ListParagraph"/>
+        <w:numPr>
+          <w:ilvl w:val="0"/>
+          <w:numId w:val="1"/>
+        </w:numPr>
+        <w:spacing w:after="60"/>
+      </w:pPr>
+      <w:r>
+        <w:t xml:space="preserve">OPM expanded structurally from ~9% (FY22) to ~22% (FY26) as scale absorbed largely fixed operating costs of a project-application business.</w:t>
+      </w:r>
+    </w:p>
+    <w:p>
+      <w:pPr>
+        <w:pStyle w:val="ListParagraph"/>
+        <w:numPr>
+          <w:ilvl w:val="0"/>
+          <w:numId w:val="1"/>
+        </w:numPr>
+        <w:spacing w:after="60"/>
+      </w:pPr>
+      <w:r>
+        <w:t xml:space="preserve">ROCE improved to ~30-32% (FY25) from a lower base; zero debt throughout -- a genuinely high-quality, high-return balance sheet.</w:t>
+      </w:r>
+    </w:p>
+    <w:p>
+      <w:pPr>
+        <w:pStyle w:val="ListParagraph"/>
+        <w:numPr>
+          <w:ilvl w:val="0"/>
+          <w:numId w:val="1"/>
+        </w:numPr>
+        <w:spacing w:after="60"/>
+      </w:pPr>
+      <w:r>
+        <w:t xml:space="preserve">Promoter holding flat at 63.09% for 2+ years (Mar-2024 through Mar-2026) with no pledge disclosed -- no ownership-alignment red flag.</w:t>
+      </w:r>
+    </w:p>
+    <w:p>
+      <w:pPr>
+        <w:pStyle w:val="ListParagraph"/>
+        <w:numPr>
+          <w:ilvl w:val="0"/>
+          <w:numId w:val="1"/>
+        </w:numPr>
+        <w:spacing w:after="60"/>
+      </w:pPr>
+      <w:r>
+        <w:t xml:space="preserve">Track-record check: all 3 checkable fiscal years (FY23-FY25) cleared BOTH &gt;=10% revenue growth AND &gt;=15% ROCE -- genuine Coffee-Can consistency, not a one-off spike.</w:t>
+      </w:r>
+    </w:p>
+    <w:p>
+      <w:pPr>
+        <w:spacing w:after="120"/>
+      </w:pPr>
+      <w:r>
+        <w:rPr>
+          <w:b/>
+          <w:bCs/>
+          <w:sz w:val="20"/>
+          <w:szCs w:val="20"/>
+        </w:rPr>
+        <w:t xml:space="preserve">Quarterly trend (last ~4 quarters + concall commentary):</w:t>
+      </w:r>
+    </w:p>
+    <w:p>
+      <w:pPr>
+        <w:pStyle w:val="ListParagraph"/>
+        <w:numPr>
+          <w:ilvl w:val="0"/>
+          <w:numId w:val="1"/>
+        </w:numPr>
+        <w:spacing w:after="60"/>
+      </w:pPr>
+      <w:r>
+        <w:t xml:space="preserve">Half-yearly YoY growth has decelerated steadily: +48% (Sep-24), +17% (Mar-25), +15% (Sep-25), +14% (Mar-26) -- still double-digit but off a much higher base.</w:t>
+      </w:r>
+    </w:p>
+    <w:p>
+      <w:pPr>
+        <w:pStyle w:val="ListParagraph"/>
+        <w:numPr>
+          <w:ilvl w:val="0"/>
+          <w:numId w:val="1"/>
+        </w:numPr>
+        <w:spacing w:after="60"/>
+      </w:pPr>
+      <w:r>
+        <w:t xml:space="preserve">OPM hit fresh highs of ~21-22% in Sep-25/Mar-26 vs ~15-16% two years earlier -- margin expansion has been the primary profit driver, not just volume.</w:t>
+      </w:r>
+    </w:p>
+    <w:p>
+      <w:pPr>
+        <w:pStyle w:val="ListParagraph"/>
+        <w:numPr>
+          <w:ilvl w:val="0"/>
+          <w:numId w:val="1"/>
+        </w:numPr>
+        <w:spacing w:after="60"/>
+      </w:pPr>
+      <w:r>
+        <w:t xml:space="preserve">No concalls exist for this SME; guidance/commentary is limited to AGM notices and BSE filings.</w:t>
+      </w:r>
+    </w:p>
+    <w:p>
+      <w:pPr>
+        <w:spacing w:after="120"/>
+      </w:pPr>
+      <w:r>
+        <w:rPr>
+          <w:b/>
+          <w:bCs/>
+          <w:sz w:val="20"/>
+          <w:szCs w:val="20"/>
+        </w:rPr>
+        <w:t xml:space="preserve">Exchange announcements (last 6 months):</w:t>
+      </w:r>
+    </w:p>
+    <w:p>
+      <w:pPr>
+        <w:pStyle w:val="ListParagraph"/>
+        <w:numPr>
+          <w:ilvl w:val="0"/>
+          <w:numId w:val="1"/>
+        </w:numPr>
+        <w:spacing w:after="60"/>
+      </w:pPr>
+      <w:r>
+        <w:t xml:space="preserve">Jul-2026 AGM: all 9 resolutions passed, including a Rs 4/share final dividend.</w:t>
+      </w:r>
+    </w:p>
+    <w:p>
+      <w:pPr>
+        <w:pStyle w:val="ListParagraph"/>
+        <w:numPr>
+          <w:ilvl w:val="0"/>
+          <w:numId w:val="1"/>
+        </w:numPr>
+        <w:spacing w:after="60"/>
+      </w:pPr>
+      <w:r>
+        <w:t xml:space="preserve">Sep-2026: an untrusted forum poster flagged a jump in aggregate MD/ED remuneration tied to a sales-linked commission across 4 directors -- unresolved, not corroborated by a trusted user, no regulatory action found.</w:t>
+      </w:r>
+    </w:p>
+    <w:p>
+      <w:pPr>
+        <w:pStyle w:val="ListParagraph"/>
+        <w:numPr>
+          <w:ilvl w:val="0"/>
+          <w:numId w:val="1"/>
+        </w:numPr>
+        <w:spacing w:after="60"/>
+      </w:pPr>
+      <w:r>
+        <w:t xml:space="preserve">No capex, M&amp;A, fund-raise, or own-brand launch announcement found in the last 6 months -- the own-brand optionality remains undelivered.</w:t>
+      </w:r>
+    </w:p>
+    <w:p>
+      <w:pPr>
+        <w:spacing w:after="120"/>
+      </w:pPr>
+      <w:r>
+        <w:rPr>
+          <w:b/>
+          <w:bCs/>
+          <w:sz w:val="20"/>
+          <w:szCs w:val="20"/>
+        </w:rPr>
+        <w:t xml:space="preserve">Key new facts vs. the prior write-up:</w:t>
+      </w:r>
+    </w:p>
+    <w:p>
+      <w:pPr>
+        <w:pStyle w:val="ListParagraph"/>
+        <w:numPr>
+          <w:ilvl w:val="0"/>
+          <w:numId w:val="1"/>
+        </w:numPr>
+        <w:spacing w:after="60"/>
+      </w:pPr>
+      <w:r>
+        <w:t xml:space="preserve">First primary-document pass: confirms the thread's cash-hoarding narrative with hard numbers (net cash ~Rs 9.7 Cr, zero debt) and adds a clean 3/3-year Coffee-Can consistency read plus a structural (not just cyclical) margin-expansion story.</w:t>
+      </w:r>
+    </w:p>
+    <w:p>
+      <w:pPr>
+        <w:pStyle w:val="ListParagraph"/>
+        <w:numPr>
+          <w:ilvl w:val="0"/>
+          <w:numId w:val="1"/>
+        </w:numPr>
+        <w:spacing w:after="60"/>
+      </w:pPr>
+      <w:r>
+        <w:t xml:space="preserve">At ~14.5x trailing P/E for ~24% ROE / debt-free / consistent growth, the market does not obviously price in the quality -- looks cheap on a reverse-P/E basis, though the SME/Emerge illiquidity discount partly explains it.</w:t>
+      </w:r>
+    </w:p>
+    <w:p>
+      <w:pPr>
+        <w:spacing w:after="120"/>
+      </w:pPr>
+      <w:r>
+        <w:rPr>
+          <w:b/>
+          <w:bCs/>
+          <w:sz w:val="20"/>
+          <w:szCs w:val="20"/>
+        </w:rPr>
+        <w:t xml:space="preserve">Open questions / what to watch:</w:t>
+      </w:r>
+    </w:p>
+    <w:p>
+      <w:pPr>
+        <w:pStyle w:val="ListParagraph"/>
+        <w:numPr>
+          <w:ilvl w:val="0"/>
+          <w:numId w:val="1"/>
+        </w:numPr>
+        <w:spacing w:after="60"/>
+      </w:pPr>
+      <w:r>
+        <w:t xml:space="preserve">Sep-2026 MD/ED remuneration-commission question remains unaddressed by management or a trusted user -- worth a re-check next pass.</w:t>
+      </w:r>
+    </w:p>
+    <w:p>
+      <w:pPr>
+        <w:pStyle w:val="ListParagraph"/>
+        <w:numPr>
+          <w:ilvl w:val="0"/>
+          <w:numId w:val="1"/>
+        </w:numPr>
+        <w:spacing w:after="60"/>
+      </w:pPr>
+      <w:r>
+        <w:t xml:space="preserve">No visibility into related-party transactions from the annual report's own RPT note (only aggregator/thread data reviewed this pass) -- rpt_trend left 'unclear'.</w:t>
+      </w:r>
+    </w:p>
+    <w:p>
+      <w:pPr>
+        <w:pStyle w:val="ListParagraph"/>
+        <w:numPr>
+          <w:ilvl w:val="0"/>
+          <w:numId w:val="1"/>
+        </w:numPr>
+        <w:spacing w:after="60"/>
+      </w:pPr>
+      <w:r>
+        <w:t xml:space="preserve">Own-brand manufacturing plan still just a stated intention with no execution timeline after 2+ years.</w:t>
+      </w:r>
+    </w:p>
+    <w:p>
+      <w:pPr>
+        <w:spacing w:after="120" w:before="120"/>
+      </w:pPr>
+      <w:r>
+        <w:rPr>
+          <w:b/>
+          <w:bCs/>
+          <w:sz w:val="20"/>
+          <w:szCs w:val="20"/>
+        </w:rPr>
+        <w:t xml:space="preserve">Conviction impact: </w:t>
+      </w:r>
+      <w:r>
+        <w:rPr>
+          <w:sz w:val="20"/>
+          <w:szCs w:val="20"/>
+        </w:rPr>
+        <w:t xml:space="preserve">Medium -&gt; Medium. Filings confirm genuine quality (debt-free, ~24-32% ROCE, 3/3-year Coffee-Can consistency, structural margin expansion) and a cheap-looking valuation (~14.5x P/E), but growth is visibly decelerating off a smaller base, TAM stays narrow as a pure applicator, and the persistent capital-allocation drag plus an unresolved governance question keep this a quality compounder, not an asymmetric bet -- no change to the 'neither' thesis-fit or Medium conviction.</w:t>
+      </w:r>
+    </w:p>
+    <w:p>
+      <w:pPr>
+        <w:pStyle w:val="Heading1"/>
+        <w:spacing w:after="120" w:before="280"/>
+      </w:pPr>
+      <w:r>
+        <w:t xml:space="preserve">Guidance &amp; Expectation Gap</w:t>
+      </w:r>
+    </w:p>
+    <w:p>
+      <w:pPr>
+        <w:spacing w:after="120"/>
+      </w:pPr>
       <w:r>
         <w:rPr>
           <w:i/>
@@ -380,20 +677,12 @@
           <w:sz w:val="18"/>
           <w:szCs w:val="18"/>
         </w:rPr>
-        <w:t xml:space="preserve"/>
-      </w:r>
-      <w:r>
-        <w:rPr>
-          <w:sz w:val="20"/>
-          <w:szCs w:val="20"/>
-        </w:rPr>
-        <w:br/>
-        <w:t xml:space="preserve">: undefined</w:t>
-      </w:r>
-    </w:p>
-    <w:p>
-      <w:pPr>
-        <w:spacing w:after="100"/>
+        <w:t xml:space="preserve">Management guidance decoded into commitments, graded on the expectation → action → operational → commercial → financial ladder, then compared to what the current price appears to assume. Method: playbook/guidance-and-expectation-gap.md.</w:t>
+      </w:r>
+    </w:p>
+    <w:p>
+      <w:pPr>
+        <w:spacing w:after="120"/>
       </w:pPr>
       <w:r>
         <w:rPr>
@@ -402,8 +691,721 @@
           <w:sz w:val="20"/>
           <w:szCs w:val="20"/>
         </w:rPr>
-        <w:t xml:space="preserve">2023-01-30 — undefined</w:t>
-      </w:r>
+        <w:t xml:space="preserve">Commitment ladder (most-proven first):</w:t>
+      </w:r>
+    </w:p>
+    <w:tbl>
+      <w:tblPr>
+        <w:tblW w:type="dxa" w:w="9000"/>
+        <w:tblBorders>
+          <w:top w:val="single" w:color="auto" w:sz="4"/>
+          <w:left w:val="single" w:color="auto" w:sz="4"/>
+          <w:bottom w:val="single" w:color="auto" w:sz="4"/>
+          <w:right w:val="single" w:color="auto" w:sz="4"/>
+          <w:insideH w:val="single" w:color="auto" w:sz="4"/>
+          <w:insideV w:val="single" w:color="auto" w:sz="4"/>
+        </w:tblBorders>
+      </w:tblPr>
+      <w:tblGrid>
+        <w:gridCol w:w="1100"/>
+        <w:gridCol w:w="2600"/>
+        <w:gridCol w:w="2400"/>
+        <w:gridCol w:w="900"/>
+        <w:gridCol w:w="1200"/>
+        <w:gridCol w:w="800"/>
+      </w:tblGrid>
+      <w:tr>
+        <w:trPr>
+          <w:tblHeader/>
+        </w:trPr>
+        <w:tc>
+          <w:tcPr>
+            <w:tcW w:type="dxa" w:w="1100"/>
+            <w:shd w:fill="F2F2F2" w:val="clear"/>
+          </w:tcPr>
+          <w:p>
+            <w:r>
+              <w:rPr>
+                <w:b/>
+                <w:bCs/>
+                <w:sz w:val="18"/>
+                <w:szCs w:val="18"/>
+              </w:rPr>
+              <w:t xml:space="preserve">Area</w:t>
+            </w:r>
+          </w:p>
+        </w:tc>
+        <w:tc>
+          <w:tcPr>
+            <w:tcW w:type="dxa" w:w="2600"/>
+            <w:shd w:fill="F2F2F2" w:val="clear"/>
+          </w:tcPr>
+          <w:p>
+            <w:r>
+              <w:rPr>
+                <w:b/>
+                <w:bCs/>
+                <w:sz w:val="18"/>
+                <w:szCs w:val="18"/>
+              </w:rPr>
+              <w:t xml:space="preserve">Commitment</w:t>
+            </w:r>
+          </w:p>
+        </w:tc>
+        <w:tc>
+          <w:tcPr>
+            <w:tcW w:type="dxa" w:w="2400"/>
+            <w:shd w:fill="F2F2F2" w:val="clear"/>
+          </w:tcPr>
+          <w:p>
+            <w:r>
+              <w:rPr>
+                <w:b/>
+                <w:bCs/>
+                <w:sz w:val="18"/>
+                <w:szCs w:val="18"/>
+              </w:rPr>
+              <w:t xml:space="preserve">Specifics</w:t>
+            </w:r>
+          </w:p>
+        </w:tc>
+        <w:tc>
+          <w:tcPr>
+            <w:tcW w:type="dxa" w:w="900"/>
+            <w:shd w:fill="F2F2F2" w:val="clear"/>
+          </w:tcPr>
+          <w:p>
+            <w:r>
+              <w:rPr>
+                <w:b/>
+                <w:bCs/>
+                <w:sz w:val="18"/>
+                <w:szCs w:val="18"/>
+              </w:rPr>
+              <w:t xml:space="preserve">By when</w:t>
+            </w:r>
+          </w:p>
+        </w:tc>
+        <w:tc>
+          <w:tcPr>
+            <w:tcW w:type="dxa" w:w="1200"/>
+            <w:shd w:fill="F2F2F2" w:val="clear"/>
+          </w:tcPr>
+          <w:p>
+            <w:r>
+              <w:rPr>
+                <w:b/>
+                <w:bCs/>
+                <w:sz w:val="18"/>
+                <w:szCs w:val="18"/>
+              </w:rPr>
+              <w:t xml:space="preserve">Stage</w:t>
+            </w:r>
+          </w:p>
+        </w:tc>
+        <w:tc>
+          <w:tcPr>
+            <w:tcW w:type="dxa" w:w="800"/>
+            <w:shd w:fill="F2F2F2" w:val="clear"/>
+          </w:tcPr>
+          <w:p>
+            <w:r>
+              <w:rPr>
+                <w:b/>
+                <w:bCs/>
+                <w:sz w:val="18"/>
+                <w:szCs w:val="18"/>
+              </w:rPr>
+              <w:t xml:space="preserve">Thesis-critical</w:t>
+            </w:r>
+          </w:p>
+        </w:tc>
+      </w:tr>
+      <w:tr>
+        <w:tc>
+          <w:tcPr>
+            <w:tcW w:type="dxa" w:w="1100"/>
+          </w:tcPr>
+          <w:p>
+            <w:r>
+              <w:rPr>
+                <w:b w:val="false"/>
+                <w:bCs w:val="false"/>
+                <w:sz w:val="18"/>
+                <w:szCs w:val="18"/>
+              </w:rPr>
+              <w:t xml:space="preserve">new_business</w:t>
+            </w:r>
+          </w:p>
+        </w:tc>
+        <w:tc>
+          <w:tcPr>
+            <w:tcW w:type="dxa" w:w="2600"/>
+          </w:tcPr>
+          <w:p>
+            <w:r>
+              <w:rPr>
+                <w:b w:val="false"/>
+                <w:bCs w:val="false"/>
+                <w:sz w:val="18"/>
+                <w:szCs w:val="18"/>
+              </w:rPr>
+              <w:t xml:space="preserve">Own-branded paint product line (vs. pure SKK application/marketing)</w:t>
+            </w:r>
+          </w:p>
+        </w:tc>
+        <w:tc>
+          <w:tcPr>
+            <w:tcW w:type="dxa" w:w="2400"/>
+          </w:tcPr>
+          <w:p>
+            <w:r>
+              <w:rPr>
+                <w:b w:val="false"/>
+                <w:bCs w:val="false"/>
+                <w:sz w:val="18"/>
+                <w:szCs w:val="18"/>
+              </w:rPr>
+              <w:t xml:space="preserve">Referenced repeatedly by management/thread as an aspiration; no product, brand, or launch date disclosed</w:t>
+            </w:r>
+          </w:p>
+        </w:tc>
+        <w:tc>
+          <w:tcPr>
+            <w:tcW w:type="dxa" w:w="900"/>
+          </w:tcPr>
+          <w:p>
+            <w:r>
+              <w:rPr>
+                <w:b w:val="false"/>
+                <w:bCs w:val="false"/>
+                <w:sz w:val="18"/>
+                <w:szCs w:val="18"/>
+              </w:rPr>
+              <w:t xml:space="preserve">beyond</w:t>
+            </w:r>
+          </w:p>
+        </w:tc>
+        <w:tc>
+          <w:tcPr>
+            <w:tcW w:type="dxa" w:w="1200"/>
+          </w:tcPr>
+          <w:p>
+            <w:r>
+              <w:rPr>
+                <w:b w:val="false"/>
+                <w:bCs w:val="false"/>
+                <w:sz w:val="18"/>
+                <w:szCs w:val="18"/>
+              </w:rPr>
+              <w:t xml:space="preserve">expectation</w:t>
+            </w:r>
+          </w:p>
+        </w:tc>
+        <w:tc>
+          <w:tcPr>
+            <w:tcW w:type="dxa" w:w="800"/>
+          </w:tcPr>
+          <w:p>
+            <w:r>
+              <w:rPr>
+                <w:b w:val="false"/>
+                <w:bCs w:val="false"/>
+                <w:sz w:val="18"/>
+                <w:szCs w:val="18"/>
+              </w:rPr>
+              <w:t xml:space="preserve"/>
+            </w:r>
+          </w:p>
+        </w:tc>
+      </w:tr>
+    </w:tbl>
+    <w:p>
+      <w:pPr>
+        <w:spacing w:after="60" w:before="120"/>
+      </w:pPr>
+      <w:r>
+        <w:rPr>
+          <w:b/>
+          <w:bCs/>
+          <w:sz w:val="20"/>
+          <w:szCs w:val="20"/>
+        </w:rPr>
+        <w:t xml:space="preserve">Earnings chain: </w:t>
+      </w:r>
+      <w:r>
+        <w:rPr>
+          <w:b w:val="false"/>
+          <w:bCs w:val="false"/>
+          <w:sz w:val="20"/>
+          <w:szCs w:val="20"/>
+        </w:rPr>
+        <w:t xml:space="preserve">project wins / SKK volume allocation</w:t>
+      </w:r>
+      <w:r>
+        <w:rPr>
+          <w:color w:val="666666"/>
+          <w:sz w:val="20"/>
+          <w:szCs w:val="20"/>
+        </w:rPr>
+        <w:t xml:space="preserve"> → </w:t>
+      </w:r>
+      <w:r>
+        <w:rPr>
+          <w:b w:val="false"/>
+          <w:bCs w:val="false"/>
+          <w:sz w:val="20"/>
+          <w:szCs w:val="20"/>
+        </w:rPr>
+        <w:t xml:space="preserve">revenue growth</w:t>
+      </w:r>
+      <w:r>
+        <w:rPr>
+          <w:color w:val="666666"/>
+          <w:sz w:val="20"/>
+          <w:szCs w:val="20"/>
+        </w:rPr>
+        <w:t xml:space="preserve"> → </w:t>
+      </w:r>
+      <w:r>
+        <w:rPr>
+          <w:b w:val="false"/>
+          <w:bCs w:val="false"/>
+          <w:sz w:val="20"/>
+          <w:szCs w:val="20"/>
+        </w:rPr>
+        <w:t xml:space="preserve">fixed-cost absorption (operating leverage)</w:t>
+      </w:r>
+      <w:r>
+        <w:rPr>
+          <w:color w:val="666666"/>
+          <w:sz w:val="20"/>
+          <w:szCs w:val="20"/>
+        </w:rPr>
+        <w:t xml:space="preserve"> → </w:t>
+      </w:r>
+      <w:r>
+        <w:rPr>
+          <w:b w:val="false"/>
+          <w:bCs w:val="false"/>
+          <w:sz w:val="20"/>
+          <w:szCs w:val="20"/>
+        </w:rPr>
+        <w:t xml:space="preserve">OPM expansion</w:t>
+      </w:r>
+      <w:r>
+        <w:rPr>
+          <w:color w:val="666666"/>
+          <w:sz w:val="20"/>
+          <w:szCs w:val="20"/>
+        </w:rPr>
+        <w:t xml:space="preserve"> → </w:t>
+      </w:r>
+      <w:r>
+        <w:rPr>
+          <w:b w:val="false"/>
+          <w:bCs w:val="false"/>
+          <w:sz w:val="20"/>
+          <w:szCs w:val="20"/>
+        </w:rPr>
+        <w:t xml:space="preserve">PAT</w:t>
+      </w:r>
+    </w:p>
+    <w:p>
+      <w:pPr>
+        <w:spacing w:after="120"/>
+      </w:pPr>
+      <w:r>
+        <w:rPr>
+          <w:color w:val="666666"/>
+          <w:sz w:val="18"/>
+          <w:szCs w:val="18"/>
+        </w:rPr>
+        <w:t xml:space="preserve">Bottleneck link: project pipeline / SKK product allocation to Siddhika as its Indian applicator.</w:t>
+      </w:r>
+    </w:p>
+    <w:p>
+      <w:pPr>
+        <w:spacing w:after="120"/>
+      </w:pPr>
+      <w:r>
+        <w:rPr>
+          <w:color w:val="666666"/>
+          <w:sz w:val="18"/>
+          <w:szCs w:val="18"/>
+        </w:rPr>
+        <w:t xml:space="preserve">Operating leverage: yes -- OPM up from ~9% (FY22) to ~22% (FY26) as scale absorbed largely fixed application/overhead costs</w:t>
+      </w:r>
+    </w:p>
+    <w:p>
+      <w:pPr>
+        <w:spacing w:after="120"/>
+      </w:pPr>
+      <w:r>
+        <w:rPr>
+          <w:color w:val="666666"/>
+          <w:sz w:val="18"/>
+          <w:szCs w:val="18"/>
+        </w:rPr>
+        <w:t xml:space="preserve">Evidenced: revenue growth; fixed-cost absorption (operating leverage); OPM expansion. Still assumed: project wins / SKK volume allocation continuing at a similar pace.</w:t>
+      </w:r>
+    </w:p>
+    <w:p>
+      <w:pPr>
+        <w:spacing w:after="120"/>
+      </w:pPr>
+      <w:r>
+        <w:rPr>
+          <w:b/>
+          <w:bCs/>
+          <w:sz w:val="20"/>
+          <w:szCs w:val="20"/>
+        </w:rPr>
+        <w:t xml:space="preserve">Market expectation vs. our path:</w:t>
+      </w:r>
+    </w:p>
+    <w:tbl>
+      <w:tblPr>
+        <w:tblW w:type="dxa" w:w="9000"/>
+        <w:tblBorders>
+          <w:top w:val="single" w:color="auto" w:sz="4"/>
+          <w:left w:val="single" w:color="auto" w:sz="4"/>
+          <w:bottom w:val="single" w:color="auto" w:sz="4"/>
+          <w:right w:val="single" w:color="auto" w:sz="4"/>
+          <w:insideH w:val="single" w:color="auto" w:sz="4"/>
+          <w:insideV w:val="single" w:color="auto" w:sz="4"/>
+        </w:tblBorders>
+      </w:tblPr>
+      <w:tblGrid>
+        <w:gridCol w:w="3200"/>
+        <w:gridCol w:w="5800"/>
+      </w:tblGrid>
+      <w:tr>
+        <w:tc>
+          <w:tcPr>
+            <w:tcW w:type="dxa" w:w="3200"/>
+            <w:shd w:fill="F2F2F2" w:val="clear"/>
+          </w:tcPr>
+          <w:p>
+            <w:r>
+              <w:rPr>
+                <w:b/>
+                <w:bCs/>
+              </w:rPr>
+              <w:t xml:space="preserve">As of</w:t>
+            </w:r>
+          </w:p>
+        </w:tc>
+        <w:tc>
+          <w:tcPr>
+            <w:tcW w:type="dxa" w:w="5800"/>
+          </w:tcPr>
+          <w:p>
+            <w:r>
+              <w:t xml:space="preserve">2026-09-17</w:t>
+            </w:r>
+          </w:p>
+        </w:tc>
+      </w:tr>
+      <w:tr>
+        <w:tc>
+          <w:tcPr>
+            <w:tcW w:type="dxa" w:w="3200"/>
+            <w:shd w:fill="F2F2F2" w:val="clear"/>
+          </w:tcPr>
+          <w:p>
+            <w:r>
+              <w:rPr>
+                <w:b/>
+                <w:bCs/>
+              </w:rPr>
+              <w:t xml:space="preserve">Price / multiple</w:t>
+            </w:r>
+          </w:p>
+        </w:tc>
+        <w:tc>
+          <w:tcPr>
+            <w:tcW w:type="dxa" w:w="5800"/>
+          </w:tcPr>
+          <w:p>
+            <w:r>
+              <w:t xml:space="preserve">Rs 226 · 14.5x P/E</w:t>
+            </w:r>
+          </w:p>
+        </w:tc>
+      </w:tr>
+      <w:tr>
+        <w:tc>
+          <w:tcPr>
+            <w:tcW w:type="dxa" w:w="3200"/>
+            <w:shd w:fill="F2F2F2" w:val="clear"/>
+          </w:tcPr>
+          <w:p>
+            <w:r>
+              <w:rPr>
+                <w:b/>
+                <w:bCs/>
+              </w:rPr>
+              <w:t xml:space="preserve">Right valuation lens</w:t>
+            </w:r>
+          </w:p>
+        </w:tc>
+        <w:tc>
+          <w:tcPr>
+            <w:tcW w:type="dxa" w:w="5800"/>
+          </w:tcPr>
+          <w:p>
+            <w:r>
+              <w:t xml:space="preserve">P/E</w:t>
+            </w:r>
+          </w:p>
+        </w:tc>
+      </w:tr>
+      <w:tr>
+        <w:tc>
+          <w:tcPr>
+            <w:tcW w:type="dxa" w:w="3200"/>
+            <w:shd w:fill="F2F2F2" w:val="clear"/>
+          </w:tcPr>
+          <w:p>
+            <w:r>
+              <w:rPr>
+                <w:b/>
+                <w:bCs/>
+              </w:rPr>
+              <w:t xml:space="preserve">Price implies</w:t>
+            </w:r>
+          </w:p>
+        </w:tc>
+        <w:tc>
+          <w:tcPr>
+            <w:tcW w:type="dxa" w:w="5800"/>
+          </w:tcPr>
+          <w:p>
+            <w:r>
+              <w:t xml:space="preserve">At ~14.5x trailing P/E for a debt-free, ~24% ROE compounder, the market appears to be pricing in only modest (~10-12%) forward EPS growth via reverse-P/E against a ~18-22x steady-compounder exit multiple -- below the mid-teens growth still being delivered.</w:t>
+            </w:r>
+          </w:p>
+        </w:tc>
+      </w:tr>
+      <w:tr>
+        <w:tc>
+          <w:tcPr>
+            <w:tcW w:type="dxa" w:w="3200"/>
+            <w:shd w:fill="F2F2F2" w:val="clear"/>
+          </w:tcPr>
+          <w:p>
+            <w:r>
+              <w:rPr>
+                <w:b/>
+                <w:bCs/>
+              </w:rPr>
+              <w:t xml:space="preserve">Our FY27</w:t>
+            </w:r>
+          </w:p>
+        </w:tc>
+        <w:tc>
+          <w:tcPr>
+            <w:tcW w:type="dxa" w:w="5800"/>
+          </w:tcPr>
+          <w:p>
+            <w:r>
+              <w:t xml:space="preserve">Revenue growth mid-teens (continuing the FY26 exit rate), OPM holding near record ~20-22% levels, PAT growth roughly tracking or slightly ahead of revenue on operating leverage</w:t>
+            </w:r>
+          </w:p>
+        </w:tc>
+      </w:tr>
+      <w:tr>
+        <w:tc>
+          <w:tcPr>
+            <w:tcW w:type="dxa" w:w="3200"/>
+            <w:shd w:fill="F2F2F2" w:val="clear"/>
+          </w:tcPr>
+          <w:p>
+            <w:r>
+              <w:rPr>
+                <w:b/>
+                <w:bCs/>
+              </w:rPr>
+              <w:t xml:space="preserve">Our FY28</w:t>
+            </w:r>
+          </w:p>
+        </w:tc>
+        <w:tc>
+          <w:tcPr>
+            <w:tcW w:type="dxa" w:w="5800"/>
+          </w:tcPr>
+          <w:p>
+            <w:r>
+              <w:t xml:space="preserve">Similar mid-teens compounding absent a capital-allocation change or an own-brand launch; no visible second growth leg yet confirmed</w:t>
+            </w:r>
+          </w:p>
+        </w:tc>
+      </w:tr>
+      <w:tr>
+        <w:tc>
+          <w:tcPr>
+            <w:tcW w:type="dxa" w:w="3200"/>
+            <w:shd w:fill="F2F2F2" w:val="clear"/>
+          </w:tcPr>
+          <w:p>
+            <w:r>
+              <w:rPr>
+                <w:b/>
+                <w:bCs/>
+              </w:rPr>
+              <w:t xml:space="preserve">Gap direction</w:t>
+            </w:r>
+          </w:p>
+        </w:tc>
+        <w:tc>
+          <w:tcPr>
+            <w:tcW w:type="dxa" w:w="5800"/>
+          </w:tcPr>
+          <w:p>
+            <w:r>
+              <w:t xml:space="preserve">underestimated</w:t>
+            </w:r>
+          </w:p>
+        </w:tc>
+      </w:tr>
+      <w:tr>
+        <w:tc>
+          <w:tcPr>
+            <w:tcW w:type="dxa" w:w="3200"/>
+            <w:shd w:fill="F2F2F2" w:val="clear"/>
+          </w:tcPr>
+          <w:p>
+            <w:r>
+              <w:rPr>
+                <w:b/>
+                <w:bCs/>
+              </w:rPr>
+              <w:t xml:space="preserve">Gap type</w:t>
+            </w:r>
+          </w:p>
+        </w:tc>
+        <w:tc>
+          <w:tcPr>
+            <w:tcW w:type="dxa" w:w="5800"/>
+          </w:tcPr>
+          <w:p>
+            <w:r>
+              <w:t xml:space="preserve">margin</w:t>
+            </w:r>
+          </w:p>
+        </w:tc>
+      </w:tr>
+      <w:tr>
+        <w:tc>
+          <w:tcPr>
+            <w:tcW w:type="dxa" w:w="3200"/>
+            <w:shd w:fill="F2F2F2" w:val="clear"/>
+          </w:tcPr>
+          <w:p>
+            <w:r>
+              <w:rPr>
+                <w:b/>
+                <w:bCs/>
+              </w:rPr>
+              <w:t xml:space="preserve">Gap magnitude</w:t>
+            </w:r>
+          </w:p>
+        </w:tc>
+        <w:tc>
+          <w:tcPr>
+            <w:tcW w:type="dxa" w:w="5800"/>
+          </w:tcPr>
+          <w:p>
+            <w:r>
+              <w:t xml:space="preserve">not estimable</w:t>
+            </w:r>
+          </w:p>
+        </w:tc>
+      </w:tr>
+      <w:tr>
+        <w:tc>
+          <w:tcPr>
+            <w:tcW w:type="dxa" w:w="3200"/>
+            <w:shd w:fill="F2F2F2" w:val="clear"/>
+          </w:tcPr>
+          <w:p>
+            <w:r>
+              <w:rPr>
+                <w:b/>
+                <w:bCs/>
+              </w:rPr>
+              <w:t xml:space="preserve">Gap basis</w:t>
+            </w:r>
+          </w:p>
+        </w:tc>
+        <w:tc>
+          <w:tcPr>
+            <w:tcW w:type="dxa" w:w="5800"/>
+          </w:tcPr>
+          <w:p>
+            <w:r>
+              <w:t xml:space="preserve">Structural margin expansion (OPM ~9%-&gt;~22% over 5 years, still at record highs) and a clean 3/3-year Coffee-Can consistency record are not obviously reflected in a ~14.5x trailing multiple; the SME/Emerge illiquidity discount is a plausible partial explanation, so this is a moderate rather than large gap read.</w:t>
+            </w:r>
+          </w:p>
+        </w:tc>
+      </w:tr>
+      <w:tr>
+        <w:tc>
+          <w:tcPr>
+            <w:tcW w:type="dxa" w:w="3200"/>
+            <w:shd w:fill="F2F2F2" w:val="clear"/>
+          </w:tcPr>
+          <w:p>
+            <w:r>
+              <w:rPr>
+                <w:b/>
+                <w:bCs/>
+              </w:rPr>
+              <w:t xml:space="preserve">Evidence quality</w:t>
+            </w:r>
+          </w:p>
+        </w:tc>
+        <w:tc>
+          <w:tcPr>
+            <w:tcW w:type="dxa" w:w="5800"/>
+          </w:tcPr>
+          <w:p>
+            <w:r>
+              <w:t xml:space="preserve">weak</w:t>
+            </w:r>
+          </w:p>
+        </w:tc>
+      </w:tr>
+    </w:tbl>
+    <w:p>
+      <w:pPr>
+        <w:spacing w:after="120"/>
+      </w:pPr>
+      <w:r>
+        <w:rPr>
+          <w:i/>
+          <w:iCs/>
+          <w:color w:val="666666"/>
+          <w:sz w:val="16"/>
+          <w:szCs w:val="16"/>
+        </w:rPr>
+        <w:t xml:space="preserve">no broker consensus; implied path is a reverse-P/E estimate + screener.in forward figures + VP thread view</w:t>
+      </w:r>
+    </w:p>
+    <w:p>
+      <w:pPr>
+        <w:pStyle w:val="Heading1"/>
+        <w:spacing w:after="120" w:before="280"/>
+      </w:pPr>
+      <w:r>
+        <w:t xml:space="preserve">Ishmohit-Lens Checks (value chain · earnings quality · growth trajectory · management · quality metrics · track record · global-signal check)</w:t>
+      </w:r>
+    </w:p>
+    <w:p>
+      <w:pPr>
+        <w:spacing w:after="120"/>
+      </w:pPr>
       <w:r>
         <w:rPr>
           <w:i/>
@@ -412,6 +1414,815 @@
           <w:sz w:val="18"/>
           <w:szCs w:val="18"/>
         </w:rPr>
+        <w:t xml:space="preserve">Extra checks drawn from @ishmohit1 / SOIC methodology (playbook/ishmohit-soic-style.md): where the company sits in its value chain and what the supply side is doing, whether a margin/PAT inflection is structural or a cyclical peak, the rate-of-change of growth vs. what the multiple demands, and management quality as a positive attribute.</w:t>
+      </w:r>
+    </w:p>
+    <w:p>
+      <w:pPr>
+        <w:spacing w:after="120"/>
+      </w:pPr>
+      <w:r>
+        <w:rPr>
+          <w:b/>
+          <w:bCs/>
+          <w:sz w:val="20"/>
+          <w:szCs w:val="20"/>
+        </w:rPr>
+        <w:t xml:space="preserve">Value chain &amp; supply side:</w:t>
+      </w:r>
+    </w:p>
+    <w:tbl>
+      <w:tblPr>
+        <w:tblW w:type="dxa" w:w="9000"/>
+        <w:tblBorders>
+          <w:top w:val="single" w:color="auto" w:sz="4"/>
+          <w:left w:val="single" w:color="auto" w:sz="4"/>
+          <w:bottom w:val="single" w:color="auto" w:sz="4"/>
+          <w:right w:val="single" w:color="auto" w:sz="4"/>
+          <w:insideH w:val="single" w:color="auto" w:sz="4"/>
+          <w:insideV w:val="single" w:color="auto" w:sz="4"/>
+        </w:tblBorders>
+      </w:tblPr>
+      <w:tblGrid>
+        <w:gridCol w:w="3200"/>
+        <w:gridCol w:w="5800"/>
+      </w:tblGrid>
+      <w:tr>
+        <w:tc>
+          <w:tcPr>
+            <w:tcW w:type="dxa" w:w="3200"/>
+            <w:shd w:fill="F2F2F2" w:val="clear"/>
+          </w:tcPr>
+          <w:p>
+            <w:r>
+              <w:rPr>
+                <w:b/>
+                <w:bCs/>
+              </w:rPr>
+              <w:t xml:space="preserve">Theme</w:t>
+            </w:r>
+          </w:p>
+        </w:tc>
+        <w:tc>
+          <w:tcPr>
+            <w:tcW w:type="dxa" w:w="5800"/>
+          </w:tcPr>
+          <w:p>
+            <w:r>
+              <w:t xml:space="preserve">paint application/contracting -- organised-vs-unorganised share gain</w:t>
+            </w:r>
+          </w:p>
+        </w:tc>
+      </w:tr>
+      <w:tr>
+        <w:tc>
+          <w:tcPr>
+            <w:tcW w:type="dxa" w:w="3200"/>
+            <w:shd w:fill="F2F2F2" w:val="clear"/>
+          </w:tcPr>
+          <w:p>
+            <w:r>
+              <w:rPr>
+                <w:b/>
+                <w:bCs/>
+              </w:rPr>
+              <w:t xml:space="preserve">This company's position</w:t>
+            </w:r>
+          </w:p>
+        </w:tc>
+        <w:tc>
+          <w:tcPr>
+            <w:tcW w:type="dxa" w:w="5800"/>
+          </w:tcPr>
+          <w:p>
+            <w:r>
+              <w:t xml:space="preserve">Authorised marketing/application partner for Japan's SK Kaken (SKK) since 18 years; India's largest single-brand texture-paint contractor, ~5M+ sq ft/yr of project work</w:t>
+            </w:r>
+          </w:p>
+        </w:tc>
+      </w:tr>
+      <w:tr>
+        <w:tc>
+          <w:tcPr>
+            <w:tcW w:type="dxa" w:w="3200"/>
+            <w:shd w:fill="F2F2F2" w:val="clear"/>
+          </w:tcPr>
+          <w:p>
+            <w:r>
+              <w:rPr>
+                <w:b/>
+                <w:bCs/>
+              </w:rPr>
+              <w:t xml:space="preserve">Bottleneck node (pricing power)</w:t>
+            </w:r>
+          </w:p>
+        </w:tc>
+        <w:tc>
+          <w:tcPr>
+            <w:tcW w:type="dxa" w:w="5800"/>
+          </w:tcPr>
+          <w:p>
+            <w:r>
+              <w:t xml:space="preserve">SKK product allocation to Siddhika as its India applicator, plus skilled-labour mobilisation for large commercial/institutional projects</w:t>
+            </w:r>
+          </w:p>
+        </w:tc>
+      </w:tr>
+      <w:tr>
+        <w:tc>
+          <w:tcPr>
+            <w:tcW w:type="dxa" w:w="3200"/>
+            <w:shd w:fill="F2F2F2" w:val="clear"/>
+          </w:tcPr>
+          <w:p>
+            <w:r>
+              <w:rPr>
+                <w:b/>
+                <w:bCs/>
+              </w:rPr>
+              <w:t xml:space="preserve">Supply-side status</w:t>
+            </w:r>
+          </w:p>
+        </w:tc>
+        <w:tc>
+          <w:tcPr>
+            <w:tcW w:type="dxa" w:w="5800"/>
+          </w:tcPr>
+          <w:p>
+            <w:r>
+              <w:t xml:space="preserve">balanced</w:t>
+            </w:r>
+          </w:p>
+        </w:tc>
+      </w:tr>
+      <w:tr>
+        <w:tc>
+          <w:tcPr>
+            <w:tcW w:type="dxa" w:w="3200"/>
+            <w:shd w:fill="F2F2F2" w:val="clear"/>
+          </w:tcPr>
+          <w:p>
+            <w:r>
+              <w:rPr>
+                <w:b/>
+                <w:bCs/>
+              </w:rPr>
+              <w:t xml:space="preserve">Adjacent-node peers</w:t>
+            </w:r>
+          </w:p>
+        </w:tc>
+        <w:tc>
+          <w:tcPr>
+            <w:tcW w:type="dxa" w:w="5800"/>
+          </w:tcPr>
+          <w:p>
+            <w:r>
+              <w:t xml:space="preserve">Sirca Paints India, Berger Paints (institutional/contracting arm), Asian Paints (institutional projects business)</w:t>
+            </w:r>
+          </w:p>
+        </w:tc>
+      </w:tr>
+    </w:tbl>
+    <w:p>
+      <w:pPr>
+        <w:spacing w:after="120"/>
+      </w:pPr>
+      <w:r>
+        <w:rPr>
+          <w:color w:val="666666"/>
+          <w:sz w:val="18"/>
+          <w:szCs w:val="18"/>
+        </w:rPr>
+        <w:t xml:space="preserve">No major capacity build-out or exit by peers observed this pass; the organised-share-gain tailwind is about demand mix shifting toward branded applicators, not a supply-side squeeze.</w:t>
+      </w:r>
+    </w:p>
+    <w:p>
+      <w:pPr>
+        <w:spacing w:after="60" w:before="120"/>
+      </w:pPr>
+      <w:r>
+        <w:rPr>
+          <w:b/>
+          <w:bCs/>
+          <w:sz w:val="20"/>
+          <w:szCs w:val="20"/>
+        </w:rPr>
+        <w:t xml:space="preserve">Earnings quality: </w:t>
+      </w:r>
+      <w:r>
+        <w:rPr>
+          <w:sz w:val="20"/>
+          <w:szCs w:val="20"/>
+        </w:rPr>
+        <w:t xml:space="preserve">margin driver mixed</w:t>
+      </w:r>
+      <w:r>
+        <w:rPr>
+          <w:b/>
+          <w:bCs/>
+          <w:color w:val="A32020"/>
+          <w:sz w:val="20"/>
+          <w:szCs w:val="20"/>
+        </w:rPr>
+        <w:t xml:space="preserve">  — PEAK-MARGIN RISK: do not capitalise current margins</w:t>
+      </w:r>
+    </w:p>
+    <w:p>
+      <w:pPr>
+        <w:spacing w:after="120"/>
+      </w:pPr>
+      <w:r>
+        <w:rPr>
+          <w:color w:val="666666"/>
+          <w:sz w:val="18"/>
+          <w:szCs w:val="18"/>
+        </w:rPr>
+        <w:t xml:space="preserve">Drivers: scale/fixed-cost absorption (structural); project mix in a given half-year (partly cyclical, given a small number of large contracts).</w:t>
+      </w:r>
+    </w:p>
+    <w:p>
+      <w:pPr>
+        <w:spacing w:after="120"/>
+      </w:pPr>
+      <w:r>
+        <w:rPr>
+          <w:color w:val="666666"/>
+          <w:sz w:val="18"/>
+          <w:szCs w:val="18"/>
+        </w:rPr>
+        <w:t xml:space="preserve">OPM ~21-22% in the last two half-years vs ~13-16% just two years earlier; plausibly durable given the scale story, but a project-mix-driven business could see margin pull back toward high-teens in a weaker-mix period -- treat the current print as a high point, not a floor.</w:t>
+      </w:r>
+    </w:p>
+    <w:p>
+      <w:pPr>
+        <w:spacing w:after="60" w:before="120"/>
+      </w:pPr>
+      <w:r>
+        <w:rPr>
+          <w:b/>
+          <w:bCs/>
+          <w:sz w:val="20"/>
+          <w:szCs w:val="20"/>
+        </w:rPr>
+        <w:t xml:space="preserve">Growth trajectory: </w:t>
+      </w:r>
+      <w:r>
+        <w:rPr>
+          <w:b/>
+          <w:bCs/>
+          <w:color w:val="A32020"/>
+          <w:sz w:val="20"/>
+          <w:szCs w:val="20"/>
+        </w:rPr>
+        <w:t xml:space="preserve">YoY growth rate is decelerating</w:t>
+      </w:r>
+    </w:p>
+    <w:p>
+      <w:pPr>
+        <w:spacing w:after="120"/>
+      </w:pPr>
+      <w:r>
+        <w:rPr>
+          <w:color w:val="666666"/>
+          <w:sz w:val="18"/>
+          <w:szCs w:val="18"/>
+        </w:rPr>
+        <w:t xml:space="preserve">Half-yearly YoY revenue growth, oldest-&gt;newest: +48% (Sep-24), +17% (Mar-25), +15% (Sep-25), +14% (Mar-26) -- steadily decelerating off a much higher base, though still double-digit.</w:t>
+      </w:r>
+    </w:p>
+    <w:p>
+      <w:pPr>
+        <w:spacing w:after="120"/>
+      </w:pPr>
+      <w:r>
+        <w:rPr>
+          <w:color w:val="666666"/>
+          <w:sz w:val="18"/>
+          <w:szCs w:val="18"/>
+        </w:rPr>
+        <w:t xml:space="preserve">Reverse P/E: At ~14.5x trailing P/E the market needs only modest (~10-12%) forward EPS growth to justify the multiple -- the business is still compounding faster than that, consistent with the 'underestimated' read above.</w:t>
+      </w:r>
+    </w:p>
+    <w:p>
+      <w:pPr>
+        <w:spacing w:after="120"/>
+      </w:pPr>
+      <w:r>
+        <w:rPr>
+          <w:b/>
+          <w:bCs/>
+          <w:sz w:val="20"/>
+          <w:szCs w:val="20"/>
+        </w:rPr>
+        <w:t xml:space="preserve">Management quality (TVGP's "P"):</w:t>
+      </w:r>
+    </w:p>
+    <w:tbl>
+      <w:tblPr>
+        <w:tblW w:type="dxa" w:w="9000"/>
+        <w:tblBorders>
+          <w:top w:val="single" w:color="auto" w:sz="4"/>
+          <w:left w:val="single" w:color="auto" w:sz="4"/>
+          <w:bottom w:val="single" w:color="auto" w:sz="4"/>
+          <w:right w:val="single" w:color="auto" w:sz="4"/>
+          <w:insideH w:val="single" w:color="auto" w:sz="4"/>
+          <w:insideV w:val="single" w:color="auto" w:sz="4"/>
+        </w:tblBorders>
+      </w:tblPr>
+      <w:tblGrid>
+        <w:gridCol w:w="3200"/>
+        <w:gridCol w:w="5800"/>
+      </w:tblGrid>
+      <w:tr>
+        <w:tc>
+          <w:tcPr>
+            <w:tcW w:type="dxa" w:w="3200"/>
+            <w:shd w:fill="F2F2F2" w:val="clear"/>
+          </w:tcPr>
+          <w:p>
+            <w:r>
+              <w:rPr>
+                <w:b/>
+                <w:bCs/>
+              </w:rPr>
+              <w:t xml:space="preserve">Assessment</w:t>
+            </w:r>
+          </w:p>
+        </w:tc>
+        <w:tc>
+          <w:tcPr>
+            <w:tcW w:type="dxa" w:w="5800"/>
+          </w:tcPr>
+          <w:p>
+            <w:r>
+              <w:t xml:space="preserve">concern</w:t>
+            </w:r>
+          </w:p>
+        </w:tc>
+      </w:tr>
+      <w:tr>
+        <w:tc>
+          <w:tcPr>
+            <w:tcW w:type="dxa" w:w="3200"/>
+            <w:shd w:fill="F2F2F2" w:val="clear"/>
+          </w:tcPr>
+          <w:p>
+            <w:r>
+              <w:rPr>
+                <w:b/>
+                <w:bCs/>
+              </w:rPr>
+              <w:t xml:space="preserve">Capital allocation</w:t>
+            </w:r>
+          </w:p>
+        </w:tc>
+        <w:tc>
+          <w:tcPr>
+            <w:tcW w:type="dxa" w:w="5800"/>
+          </w:tcPr>
+          <w:p>
+            <w:r>
+              <w:t xml:space="preserve">Generates materially more cash than the business needs; surplus (~Rs 9.7 Cr net cash) parked in mutual funds/FDs rather than reinvested or returned at scale, flagged repeatedly by shareholders since 2024. No major capex or M&amp;A this pass; the own-brand optionality remains unexecuted after 2+ years. (neutral)</w:t>
+            </w:r>
+          </w:p>
+        </w:tc>
+      </w:tr>
+      <w:tr>
+        <w:tc>
+          <w:tcPr>
+            <w:tcW w:type="dxa" w:w="3200"/>
+            <w:shd w:fill="F2F2F2" w:val="clear"/>
+          </w:tcPr>
+          <w:p>
+            <w:r>
+              <w:rPr>
+                <w:b/>
+                <w:bCs/>
+              </w:rPr>
+              <w:t xml:space="preserve">Related-party trend</w:t>
+            </w:r>
+          </w:p>
+        </w:tc>
+        <w:tc>
+          <w:tcPr>
+            <w:tcW w:type="dxa" w:w="5800"/>
+          </w:tcPr>
+          <w:p>
+            <w:r>
+              <w:t xml:space="preserve">unclear</w:t>
+            </w:r>
+          </w:p>
+        </w:tc>
+      </w:tr>
+      <w:tr>
+        <w:tc>
+          <w:tcPr>
+            <w:tcW w:type="dxa" w:w="3200"/>
+            <w:shd w:fill="F2F2F2" w:val="clear"/>
+          </w:tcPr>
+          <w:p>
+            <w:r>
+              <w:rPr>
+                <w:b/>
+                <w:bCs/>
+              </w:rPr>
+              <w:t xml:space="preserve">Guidance credibility</w:t>
+            </w:r>
+          </w:p>
+        </w:tc>
+        <w:tc>
+          <w:tcPr>
+            <w:tcW w:type="dxa" w:w="5800"/>
+          </w:tcPr>
+          <w:p>
+            <w:r>
+              <w:t xml:space="preserve">no-track-record</w:t>
+            </w:r>
+          </w:p>
+        </w:tc>
+      </w:tr>
+      <w:tr>
+        <w:tc>
+          <w:tcPr>
+            <w:tcW w:type="dxa" w:w="3200"/>
+            <w:shd w:fill="F2F2F2" w:val="clear"/>
+          </w:tcPr>
+          <w:p>
+            <w:r>
+              <w:rPr>
+                <w:b/>
+                <w:bCs/>
+              </w:rPr>
+              <w:t xml:space="preserve">Shareholder returns</w:t>
+            </w:r>
+          </w:p>
+        </w:tc>
+        <w:tc>
+          <w:tcPr>
+            <w:tcW w:type="dxa" w:w="5800"/>
+          </w:tcPr>
+          <w:p>
+            <w:r>
+              <w:t xml:space="preserve">consistent</w:t>
+            </w:r>
+          </w:p>
+        </w:tc>
+      </w:tr>
+      <w:tr>
+        <w:tc>
+          <w:tcPr>
+            <w:tcW w:type="dxa" w:w="3200"/>
+            <w:shd w:fill="F2F2F2" w:val="clear"/>
+          </w:tcPr>
+          <w:p>
+            <w:r>
+              <w:rPr>
+                <w:b/>
+                <w:bCs/>
+              </w:rPr>
+              <w:t xml:space="preserve">Capability ladder / VAP</w:t>
+            </w:r>
+          </w:p>
+        </w:tc>
+        <w:tc>
+          <w:tcPr>
+            <w:tcW w:type="dxa" w:w="5800"/>
+          </w:tcPr>
+          <w:p>
+            <w:r>
+              <w:t xml:space="preserve">Explicit but undelivered plan to move from pure application to an owned/branded paint product line (Sirca Paints comparison cited repeatedly by the thread's OP) -- flagged across 2+ years without execution.</w:t>
+            </w:r>
+          </w:p>
+        </w:tc>
+      </w:tr>
+    </w:tbl>
+    <w:p>
+      <w:pPr>
+        <w:spacing w:after="120"/>
+      </w:pPr>
+      <w:r>
+        <w:rPr>
+          <w:b/>
+          <w:bCs/>
+          <w:sz w:val="20"/>
+          <w:szCs w:val="20"/>
+        </w:rPr>
+        <w:t xml:space="preserve">Quality metrics (ROCE · debt · FCF · margin · capex):</w:t>
+      </w:r>
+    </w:p>
+    <w:tbl>
+      <w:tblPr>
+        <w:tblW w:type="dxa" w:w="9000"/>
+        <w:tblBorders>
+          <w:top w:val="single" w:color="auto" w:sz="4"/>
+          <w:left w:val="single" w:color="auto" w:sz="4"/>
+          <w:bottom w:val="single" w:color="auto" w:sz="4"/>
+          <w:right w:val="single" w:color="auto" w:sz="4"/>
+          <w:insideH w:val="single" w:color="auto" w:sz="4"/>
+          <w:insideV w:val="single" w:color="auto" w:sz="4"/>
+        </w:tblBorders>
+      </w:tblPr>
+      <w:tblGrid>
+        <w:gridCol w:w="3200"/>
+        <w:gridCol w:w="5800"/>
+      </w:tblGrid>
+      <w:tr>
+        <w:tc>
+          <w:tcPr>
+            <w:tcW w:type="dxa" w:w="3200"/>
+            <w:shd w:fill="F2F2F2" w:val="clear"/>
+          </w:tcPr>
+          <w:p>
+            <w:r>
+              <w:rPr>
+                <w:b/>
+                <w:bCs/>
+              </w:rPr>
+              <w:t xml:space="preserve">Assessment</w:t>
+            </w:r>
+          </w:p>
+        </w:tc>
+        <w:tc>
+          <w:tcPr>
+            <w:tcW w:type="dxa" w:w="5800"/>
+          </w:tcPr>
+          <w:p>
+            <w:r>
+              <w:t xml:space="preserve">positive</w:t>
+            </w:r>
+          </w:p>
+        </w:tc>
+      </w:tr>
+      <w:tr>
+        <w:tc>
+          <w:tcPr>
+            <w:tcW w:type="dxa" w:w="3200"/>
+            <w:shd w:fill="F2F2F2" w:val="clear"/>
+          </w:tcPr>
+          <w:p>
+            <w:r>
+              <w:rPr>
+                <w:b/>
+                <w:bCs/>
+              </w:rPr>
+              <w:t xml:space="preserve">ROCE</w:t>
+            </w:r>
+          </w:p>
+        </w:tc>
+        <w:tc>
+          <w:tcPr>
+            <w:tcW w:type="dxa" w:w="5800"/>
+          </w:tcPr>
+          <w:p>
+            <w:r>
+              <w:t xml:space="preserve">31.9% (improving)</w:t>
+            </w:r>
+          </w:p>
+        </w:tc>
+      </w:tr>
+      <w:tr>
+        <w:tc>
+          <w:tcPr>
+            <w:tcW w:type="dxa" w:w="3200"/>
+            <w:shd w:fill="F2F2F2" w:val="clear"/>
+          </w:tcPr>
+          <w:p>
+            <w:r>
+              <w:rPr>
+                <w:b/>
+                <w:bCs/>
+              </w:rPr>
+              <w:t xml:space="preserve">Leverage</w:t>
+            </w:r>
+          </w:p>
+        </w:tc>
+        <w:tc>
+          <w:tcPr>
+            <w:tcW w:type="dxa" w:w="5800"/>
+          </w:tcPr>
+          <w:p>
+            <w:r>
+              <w:t xml:space="preserve">Net debt/EBITDA -0.8x</w:t>
+            </w:r>
+          </w:p>
+        </w:tc>
+      </w:tr>
+      <w:tr>
+        <w:tc>
+          <w:tcPr>
+            <w:tcW w:type="dxa" w:w="3200"/>
+            <w:shd w:fill="F2F2F2" w:val="clear"/>
+          </w:tcPr>
+          <w:p>
+            <w:r>
+              <w:rPr>
+                <w:b/>
+                <w:bCs/>
+              </w:rPr>
+              <w:t xml:space="preserve">FCF conversion</w:t>
+            </w:r>
+          </w:p>
+        </w:tc>
+        <w:tc>
+          <w:tcPr>
+            <w:tcW w:type="dxa" w:w="5800"/>
+          </w:tcPr>
+          <w:p>
+            <w:r>
+              <w:t xml:space="preserve">70%</w:t>
+            </w:r>
+          </w:p>
+        </w:tc>
+      </w:tr>
+      <w:tr>
+        <w:tc>
+          <w:tcPr>
+            <w:tcW w:type="dxa" w:w="3200"/>
+            <w:shd w:fill="F2F2F2" w:val="clear"/>
+          </w:tcPr>
+          <w:p>
+            <w:r>
+              <w:rPr>
+                <w:b/>
+                <w:bCs/>
+              </w:rPr>
+              <w:t xml:space="preserve">Margin trend</w:t>
+            </w:r>
+          </w:p>
+        </w:tc>
+        <w:tc>
+          <w:tcPr>
+            <w:tcW w:type="dxa" w:w="5800"/>
+          </w:tcPr>
+          <w:p>
+            <w:r>
+              <w:t xml:space="preserve">expanding</w:t>
+            </w:r>
+          </w:p>
+        </w:tc>
+      </w:tr>
+      <w:tr>
+        <w:tc>
+          <w:tcPr>
+            <w:tcW w:type="dxa" w:w="3200"/>
+            <w:shd w:fill="F2F2F2" w:val="clear"/>
+          </w:tcPr>
+          <w:p>
+            <w:r>
+              <w:rPr>
+                <w:b/>
+                <w:bCs/>
+              </w:rPr>
+              <w:t xml:space="preserve">Capex efficiency</w:t>
+            </w:r>
+          </w:p>
+        </w:tc>
+        <w:tc>
+          <w:tcPr>
+            <w:tcW w:type="dxa" w:w="5800"/>
+          </w:tcPr>
+          <w:p>
+            <w:r>
+              <w:t xml:space="preserve">neutral</w:t>
+            </w:r>
+          </w:p>
+        </w:tc>
+      </w:tr>
+    </w:tbl>
+    <w:p>
+      <w:pPr>
+        <w:spacing w:after="60" w:before="120"/>
+      </w:pPr>
+      <w:r>
+        <w:rPr>
+          <w:b/>
+          <w:bCs/>
+          <w:sz w:val="20"/>
+          <w:szCs w:val="20"/>
+        </w:rPr>
+        <w:t xml:space="preserve">Track record (Coffee Can persistence check): </w:t>
+      </w:r>
+      <w:r>
+        <w:rPr>
+          <w:sz w:val="20"/>
+          <w:szCs w:val="20"/>
+        </w:rPr>
+        <w:t xml:space="preserve">cleared revenue growth ≥10% AND ROCE ≥15% in 3 of the last 3 years (consistency_score 100)</w:t>
+      </w:r>
+    </w:p>
+    <w:p>
+      <w:pPr>
+        <w:spacing w:after="120"/>
+      </w:pPr>
+      <w:r>
+        <w:rPr>
+          <w:color w:val="666666"/>
+          <w:sz w:val="18"/>
+          <w:szCs w:val="18"/>
+        </w:rPr>
+        <w:t xml:space="preserve">FY23, FY24, FY25 each cleared BOTH &gt;=10% revenue growth AND &gt;=15% ROCE (FY23 +58% growth; FY24 +14%; FY25 +30%, against ROCE averaging ~23% and peaking ~29-32% over the same window) -- a clean Coffee-Can pass, though only 3 fiscal years are verifiable pre-2022 scale-up so this is not yet a full decade of history.</w:t>
+      </w:r>
+    </w:p>
+    <w:p>
+      <w:pPr>
+        <w:pStyle w:val="Heading1"/>
+        <w:spacing w:after="120" w:before="280"/>
+      </w:pPr>
+      <w:r>
+        <w:t xml:space="preserve">Technical Read (Weekly / Monthly MACD + Bollinger Bands, or RSI/CCI/Williams %R proxy)</w:t>
+      </w:r>
+    </w:p>
+    <w:p>
+      <w:pPr>
+        <w:spacing w:after="120"/>
+      </w:pPr>
+      <w:r>
+        <w:t xml:space="preserve">Not escalated to charts -- a low-liquidity NSE Emerge micro-cap where technical reads are unreliable (see manipulation caution below).</w:t>
+      </w:r>
+    </w:p>
+    <w:p>
+      <w:pPr>
+        <w:pStyle w:val="Heading1"/>
+        <w:spacing w:after="120" w:before="280"/>
+      </w:pPr>
+      <w:r>
+        <w:t xml:space="preserve">ValuePickr Community Signal</w:t>
+      </w:r>
+    </w:p>
+    <w:p>
+      <w:pPr>
+        <w:spacing w:after="120"/>
+      </w:pPr>
+      <w:r>
+        <w:t xml:space="preserve">33-post thread (2022-11 to 2026-09-10), first-time read, whole thread in one batch. Long-running, substantive OP (rk1771, non-trusted but a consistent, well-informed multi-year tracker) with genuine back-and-forth on business quality, liquidity risk, and capital allocation. Sentiment is constructively positive throughout, with real scrutiny rather than pure promotion.</w:t>
+      </w:r>
+    </w:p>
+    <w:p>
+      <w:pPr>
+        <w:spacing w:after="120"/>
+      </w:pPr>
+      <w:r>
+        <w:rPr>
+          <w:b/>
+          <w:bCs/>
+          <w:sz w:val="20"/>
+          <w:szCs w:val="20"/>
+        </w:rPr>
+        <w:t xml:space="preserve">High-conviction call from a top contributor: </w:t>
+      </w:r>
+      <w:r>
+        <w:rPr>
+          <w:sz w:val="20"/>
+          <w:szCs w:val="20"/>
+        </w:rPr>
+        <w:t xml:space="preserve">sameernics (TRUSTED, elevated) raised two distinct concerns over time: in 2023, that the stock was highly illiquid and trading in upper circuits on almost no volume ('prone to operator manipulation') while calling it 'predominantly a trading company' commanding a rich P/E of ~40 -- a characterisation rk1771 pushed back on (application, not resale, business); by 2024, sameernics's tone had shifted to acknowledging it as 'a niche play in the paint segment' with 'good prospects.' In Sept-2026, an untrusted new poster (purohitjii) flagged a 69% YoY jump in MD remuneration (traced to a 0.6% sales-linked commission across 4 directors) and asked pointed questions about headcount/facilities disclosure -- unresolved but not escalated by anyone else in the thread as of this run.</w:t>
+      </w:r>
+    </w:p>
+    <w:p>
+      <w:pPr>
+        <w:pStyle w:val="Heading1"/>
+        <w:spacing w:after="120" w:before="280"/>
+      </w:pPr>
+      <w:r>
+        <w:t xml:space="preserve">Trusted-User Signals (Ongoing)</w:t>
+      </w:r>
+    </w:p>
+    <w:p>
+      <w:pPr>
+        <w:spacing w:after="120"/>
+      </w:pPr>
+      <w:r>
+        <w:rPr>
+          <w:i/>
+          <w:iCs/>
+          <w:color w:val="666666"/>
+          <w:sz w:val="18"/>
+          <w:szCs w:val="18"/>
+        </w:rPr>
+        <w:t xml:space="preserve">Every time a trusted user expresses clear conviction on this stock, most recent first — this section accumulates over time, it isn't a one-time snapshot.</w:t>
+      </w:r>
+    </w:p>
+    <w:p>
+      <w:pPr>
+        <w:spacing w:after="100"/>
+      </w:pPr>
+      <w:r>
+        <w:rPr>
+          <w:b/>
+          <w:bCs/>
+          <w:sz w:val="20"/>
+          <w:szCs w:val="20"/>
+        </w:rPr>
+        <w:t xml:space="preserve">2024-01-01 — undefined</w:t>
+      </w:r>
+      <w:r>
+        <w:rPr>
+          <w:i/>
+          <w:iCs/>
+          <w:color w:val="666666"/>
+          <w:sz w:val="18"/>
+          <w:szCs w:val="18"/>
+        </w:rPr>
         <w:t xml:space="preserve"/>
       </w:r>
       <w:r>
@@ -425,6 +2236,38 @@
     </w:p>
     <w:p>
       <w:pPr>
+        <w:spacing w:after="100"/>
+      </w:pPr>
+      <w:r>
+        <w:rPr>
+          <w:b/>
+          <w:bCs/>
+          <w:sz w:val="20"/>
+          <w:szCs w:val="20"/>
+        </w:rPr>
+        <w:t xml:space="preserve">2023-01-30 — undefined</w:t>
+      </w:r>
+      <w:r>
+        <w:rPr>
+          <w:i/>
+          <w:iCs/>
+          <w:color w:val="666666"/>
+          <w:sz w:val="18"/>
+          <w:szCs w:val="18"/>
+        </w:rPr>
+        <w:t xml:space="preserve"/>
+      </w:r>
+      <w:r>
+        <w:rPr>
+          <w:sz w:val="20"/>
+          <w:szCs w:val="20"/>
+        </w:rPr>
+        <w:br/>
+        <w:t xml:space="preserve">: undefined</w:t>
+      </w:r>
+    </w:p>
+    <w:p>
+      <w:pPr>
         <w:pStyle w:val="Heading1"/>
         <w:spacing w:after="120" w:before="280"/>
       </w:pPr>
@@ -459,7 +2302,20 @@
         <w:spacing w:after="60"/>
       </w:pPr>
       <w:r>
-        <w:t xml:space="preserve">Debt-free, ~24% ROE, ~18% ROIC, consistent multi-year profitability including through COVID</w:t>
+        <w:t xml:space="preserve">Debt-free, ~24% ROE / ~30%+ ROCE, and a clean Coffee-Can track record -- all 3 checkable fiscal years (FY23-25) cleared both &gt;=10% revenue growth AND &gt;=15% ROCE</w:t>
+      </w:r>
+    </w:p>
+    <w:p>
+      <w:pPr>
+        <w:pStyle w:val="ListParagraph"/>
+        <w:numPr>
+          <w:ilvl w:val="0"/>
+          <w:numId w:val="1"/>
+        </w:numPr>
+        <w:spacing w:after="60"/>
+      </w:pPr>
+      <w:r>
+        <w:t xml:space="preserve">Structural margin expansion, not just volume growth: OPM up from ~9% (FY22) to ~22% (FY26) as scale absorbed largely fixed project-application costs, with fresh record highs in FY26</w:t>
       </w:r>
     </w:p>
     <w:p>
@@ -486,6 +2342,19 @@
       </w:pPr>
       <w:r>
         <w:t xml:space="preserve">18-year exclusive relationship with a reputed Japanese principal (SKK) gives some relationship-based moat/switching-cost advantage in a B2B project business</w:t>
+      </w:r>
+    </w:p>
+    <w:p>
+      <w:pPr>
+        <w:pStyle w:val="ListParagraph"/>
+        <w:numPr>
+          <w:ilvl w:val="0"/>
+          <w:numId w:val="1"/>
+        </w:numPr>
+        <w:spacing w:after="60"/>
+      </w:pPr>
+      <w:r>
+        <w:t xml:space="preserve">Looks cheap for the quality on offer: ~14.5x trailing P/E against ~24% ROE and zero debt -- market does not appear to be pricing in the consistency</w:t>
       </w:r>
     </w:p>
     <w:p>
@@ -520,20 +2389,33 @@
         <w:spacing w:after="60"/>
       </w:pPr>
       <w:r>
-        <w:t xml:space="preserve">Persistent capital-allocation problem: surplus cash parked in mutual funds/FDs rather than reinvested, which will mechanically drag ROE down over time if uncorrected -- flagged by multiple posters across 2024-2026, management's only response is 'cash management'</w:t>
-      </w:r>
-    </w:p>
-    <w:p>
-      <w:pPr>
-        <w:pStyle w:val="ListParagraph"/>
-        <w:numPr>
-          <w:ilvl w:val="0"/>
-          <w:numId w:val="1"/>
-        </w:numPr>
-        <w:spacing w:after="60"/>
-      </w:pPr>
-      <w:r>
-        <w:t xml:space="preserve">Small, niche TAM as a pure applicator (not a brand owner) -- ~20-25% growth is solid but not the hypergrowth this project's '10x' bucket implies</w:t>
+        <w:t xml:space="preserve">Persistent capital-allocation problem, confirmed by this pass's numbers: net cash ~Rs 9.7 Cr sitting in mutual funds/FDs rather than reinvested, which will mechanically drag ROE down over time if uncorrected -- flagged by multiple posters across 2024-2026, management's only response is 'cash management'</w:t>
+      </w:r>
+    </w:p>
+    <w:p>
+      <w:pPr>
+        <w:pStyle w:val="ListParagraph"/>
+        <w:numPr>
+          <w:ilvl w:val="0"/>
+          <w:numId w:val="1"/>
+        </w:numPr>
+        <w:spacing w:after="60"/>
+      </w:pPr>
+      <w:r>
+        <w:t xml:space="preserve">Growth is visibly decelerating off a larger base: half-yearly YoY growth has stepped down from +48% to +17% to +15% to +14% over the last four periods</w:t>
+      </w:r>
+    </w:p>
+    <w:p>
+      <w:pPr>
+        <w:pStyle w:val="ListParagraph"/>
+        <w:numPr>
+          <w:ilvl w:val="0"/>
+          <w:numId w:val="1"/>
+        </w:numPr>
+        <w:spacing w:after="60"/>
+      </w:pPr>
+      <w:r>
+        <w:t xml:space="preserve">Small, niche TAM as a pure applicator (not a brand owner) -- mid-teens growth is solid but not the hypergrowth this project's '10x' bucket implies</w:t>
       </w:r>
     </w:p>
     <w:p>
@@ -559,7 +2441,7 @@
         <w:spacing w:after="60"/>
       </w:pPr>
       <w:r>
-        <w:t xml:space="preserve">Unresolved governance question (Sept-2026, untrusted poster) about a sharp MD remuneration increase tied to a sales commission structure across 4 directors -- not escalated further in the thread, but unaddressed</w:t>
+        <w:t xml:space="preserve">Unresolved governance question (Sept-2026, untrusted poster) about a sharp MD/ED remuneration increase tied to a sales commission structure across 4 directors -- not escalated further in the thread or corroborated by a trusted user, but unaddressed</w:t>
       </w:r>
     </w:p>
     <w:p>
@@ -593,7 +2475,7 @@
           <w:b/>
           <w:bCs/>
         </w:rPr>
-        <w:t xml:space="preserve">Micro-cap (~Rs 133 Cr)</w:t>
+        <w:t xml:space="preserve">Micro-cap (~Rs 140 Cr)</w:t>
       </w:r>
     </w:p>
     <w:p>
@@ -644,7 +2526,7 @@
           <w:sz w:val="20"/>
           <w:szCs w:val="20"/>
         </w:rPr>
-        <w:t xml:space="preserve">tailwind=yes (organised sector taking share from unorganised in paint contracting, corroborated across 4 years of thread posts and real project wins). tam=weak (niche single-brand applicator business -- real but not large; own-brand manufacturing optionality unconfirmed/delayed). moat=weak (18-year exclusive SKK relationship gives B2B switching-cost advantage but the company owns no brand/IP of its own). valuation=yes (~24% ROE, debt-free, reasonable multiple for the growth). Score 3.0 technically permits a return-magnitude label but thesis_fit set to 'neither' on judgment -- growth rate (~20-25%) does not support genuine 10x-in-2-3-years.</w:t>
+        <w:t xml:space="preserve">tailwind=yes (organised sector taking share from unorganised in paint contracting, corroborated across 4 years of thread posts and real project wins). tam=weak (niche single-brand applicator business -- real but not large; own-brand manufacturing optionality unconfirmed/delayed after 2+ years). moat=weak (18-year exclusive SKK relationship gives B2B switching-cost advantage but the company owns no brand/IP of its own). valuation=yes (~24% ROE, debt-free, ~14.5x P/E looks cheap for the quality). Score 3.0 technically permits a return-magnitude label but thesis_fit set to 'neither' on judgment -- growth rate (mid-teens, decelerating) does not support genuine 10x-in-2-3-years.</w:t>
       </w:r>
     </w:p>
     <w:p>
@@ -667,7 +2549,7 @@
           <w:sz w:val="24"/>
           <w:szCs w:val="24"/>
         </w:rPr>
-        <w:t xml:space="preserve">A genuinely clean, debt-free small-cap compounder growing 20-25% with ~24% ROE, but a steady compounder rather than an asymmetric 10x bet -- capital-allocation drag and a narrow applicator TAM cap the upside case</w:t>
+        <w:t xml:space="preserve">A genuinely clean, debt-free small-cap compounder with a clean 3/3-year Coffee-Can record and structural margin expansion, but growth is decelerating and this remains a steady compounder rather than an asymmetric 10x bet -- capital-allocation drag and a narrow applicator TAM cap the upside case</w:t>
       </w:r>
     </w:p>
     <w:p>
@@ -693,33 +2575,46 @@
         <w:spacing w:after="60"/>
       </w:pPr>
       <w:r>
-        <w:t xml:space="preserve">four_box: tailwind=yes (organised-vs-unorganised share gain, corroborated across years), tam=weak (niche single-brand applicator business, real but not large), moat=weak (18-yr SKK relationship gives switching-cost advantage but no owned brand/IP), valuation=yes (~24% ROE, debt-free, reasonable multiple for the growth on offer). Score = 3.0, which technically permits a return-magnitude label.</w:t>
-      </w:r>
-    </w:p>
-    <w:p>
-      <w:pPr>
-        <w:pStyle w:val="ListParagraph"/>
-        <w:numPr>
-          <w:ilvl w:val="0"/>
-          <w:numId w:val="1"/>
-        </w:numPr>
-        <w:spacing w:after="60"/>
-      </w:pPr>
-      <w:r>
-        <w:t xml:space="preserve">Chose 'neither' over the technically-permitted label anyway: the company's own trajectory (~20-25% steady growth, cash-hoarding rather than reinvestment) does not plausibly support a 10x-in-2-3-years outcome -- this is a quality compounder story, not an asymmetric one, and forcing the label would overstate the thesis.</w:t>
-      </w:r>
-    </w:p>
-    <w:p>
-      <w:pPr>
-        <w:pStyle w:val="ListParagraph"/>
-        <w:numPr>
-          <w:ilvl w:val="0"/>
-          <w:numId w:val="1"/>
-        </w:numPr>
-        <w:spacing w:after="60"/>
-      </w:pPr>
-      <w:r>
-        <w:t xml:space="preserve">Conviction Medium: genuine quality (debt-free, high ROE, consistent multi-year execution, real structural tailwind) offset by the capital-allocation drag, narrow TAM as a pure applicator, and the unresolved 2023 trusted-user liquidity/manipulation caution plus the unaddressed 2026 remuneration question.</w:t>
+        <w:t xml:space="preserve">four_box: tailwind=yes (organised-vs-unorganised share gain, corroborated across years), tam=weak (niche single-brand applicator business, real but not large), moat=weak (18-yr SKK relationship gives switching-cost advantage but no owned brand/IP), valuation=yes (~24% ROE, debt-free, ~14.5x P/E looks cheap for the quality on offer). Score = 3.0, which technically permits a return-magnitude label.</w:t>
+      </w:r>
+    </w:p>
+    <w:p>
+      <w:pPr>
+        <w:pStyle w:val="ListParagraph"/>
+        <w:numPr>
+          <w:ilvl w:val="0"/>
+          <w:numId w:val="1"/>
+        </w:numPr>
+        <w:spacing w:after="60"/>
+      </w:pPr>
+      <w:r>
+        <w:t xml:space="preserve">Chose 'neither' over the technically-permitted label anyway: the company's own trajectory (mid-teens and decelerating growth, cash-hoarding rather than reinvestment) does not plausibly support a 10x-in-2-3-years outcome -- this is a quality compounder story, not an asymmetric one, and forcing the label would overstate the thesis.</w:t>
+      </w:r>
+    </w:p>
+    <w:p>
+      <w:pPr>
+        <w:pStyle w:val="ListParagraph"/>
+        <w:numPr>
+          <w:ilvl w:val="0"/>
+          <w:numId w:val="1"/>
+        </w:numPr>
+        <w:spacing w:after="60"/>
+      </w:pPr>
+      <w:r>
+        <w:t xml:space="preserve">2026-09-17 deep-dive pass 1: primary filings confirm the quality (debt-free, ROCE ~30%+, 3/3 checkable fiscal years clearing the Coffee-Can bar, structural OPM expansion ~9%-&gt;~22%) and the capital-allocation drag (net cash ~Rs 9.7 Cr idle in MFs/FDs) with hard numbers. Growth is decelerating off a larger base (half-yearly YoY +48% -&gt; +17% -&gt; +15% -&gt; +14%). No change to thesis_fit or conviction -- the picture is confirmed, not moved.</w:t>
+      </w:r>
+    </w:p>
+    <w:p>
+      <w:pPr>
+        <w:pStyle w:val="ListParagraph"/>
+        <w:numPr>
+          <w:ilvl w:val="0"/>
+          <w:numId w:val="1"/>
+        </w:numPr>
+        <w:spacing w:after="60"/>
+      </w:pPr>
+      <w:r>
+        <w:t xml:space="preserve">Conviction Medium: genuine quality (debt-free, high ROE/ROCE, consistent multi-year execution, real structural tailwind, cheap-looking valuation) offset by the capital-allocation drag, narrow TAM as a pure applicator, decelerating growth, and the unresolved 2023 trusted-user liquidity/manipulation caution plus the unaddressed 2026 remuneration question.</w:t>
       </w:r>
     </w:p>
     <w:p>

</xml_diff>